<commit_message>
Update Batch 4 JDs and Ads: Corp Rep and Eval Rep get IC-to-manager growth path (3 revenue milestones then build team). Head of AI Policy gets travel budget (DC, state capitals, intl). Head of Academic Relations gets travel budget (university visits, conferences). Both JDs and Ads updated.
</commit_message>
<xml_diff>
--- a/careers/ads/Batch4_Ads_Partnerships_and_Sales.docx
+++ b/careers/ads/Batch4_Ads_Partnerships_and_Sales.docx
@@ -618,7 +618,7 @@
           <w:sz w:val="22"/>
           <w:szCs w:val="22"/>
         </w:rPr>
-        <w:t xml:space="preserve">Audacion AI Labs is building a corporate partnership program that gives organizations access to post-deployment AI safety research they cannot get anywhere else. The Corporate Partnerships Rep is the person who gets those organizations in the door.</w:t>
+        <w:t xml:space="preserve">Audacion AI Labs is building a corporate partnership program that gives organizations access to post-deployment AI safety research they cannot get anywhere else. The Corporate Partnerships Rep is the person who gets those organizations in the door. This role starts as an individual contributor. Hit your first three revenue milestones and you earn the right to build and lead your own corporate partnerships team. The revenue you generate funds the team you build.</w:t>
       </w:r>
     </w:p>
     <w:p>
@@ -1065,7 +1065,7 @@
           <w:sz w:val="22"/>
           <w:szCs w:val="22"/>
         </w:rPr>
-        <w:t xml:space="preserve">Every company deploying AI will need to know if their systems hold up after deployment. Not in testing. In production. The Post-Deployment Safety Audit from Audacion AI Labs is the only evaluation of its kind: a PRISM-framework assessment of how AI actually behaves in real operational conditions.</w:t>
+        <w:t xml:space="preserve">Every company deploying AI will need to know if their systems hold up after deployment. Not in testing. In production. The Post-Deployment Safety Audit from Audacion AI Labs is the only evaluation of its kind: a PRISM-framework assessment of how AI actually behaves in real operational conditions. This role starts as an individual contributor. Hit your first three revenue milestones and you earn the right to build and lead your own evaluations sales team.</w:t>
       </w:r>
     </w:p>
     <w:p>
@@ -1555,7 +1555,7 @@
           <w:sz w:val="22"/>
           <w:szCs w:val="22"/>
         </w:rPr>
-        <w:t xml:space="preserve">AI regulation is moving fast. The people writing the rules need empirical data on how AI actually behaves after deployment, and almost nobody is providing it. Audacion AI Labs has that data. The Head of AI Policy and Government Relations makes sure the right people in Washington and beyond know it exists.</w:t>
+        <w:t xml:space="preserve">AI regulation is moving fast. The people writing the rules need empirical data on how AI actually behaves after deployment, and almost nobody is providing it. Audacion AI Labs has that data. The Head of AI Policy and Government Relations makes sure the right people in Washington and beyond know it exists. This role includes a dedicated travel budget for DC, state capitals, and international governance convenings.</w:t>
       </w:r>
     </w:p>
     <w:p>
@@ -2092,7 +2092,7 @@
           <w:sz w:val="22"/>
           <w:szCs w:val="22"/>
         </w:rPr>
-        <w:t xml:space="preserve">The Head of Academic Relations builds the partnerships that put this research into the academic ecosystem: co-authorship agreements, university collaborations, graduate researcher pipelines, and certification distribution through academic channels.</w:t>
+        <w:t xml:space="preserve">The Head of Academic Relations builds the partnerships that put this research into the academic ecosystem: co-authorship agreements, university collaborations, graduate researcher pipelines, and certification distribution through academic channels. This role includes a travel budget for university visits, conferences, and partner meetings.</w:t>
       </w:r>
     </w:p>
     <w:p>

</xml_diff>